<commit_message>
Business and SDK document
</commit_message>
<xml_diff>
--- a/BUSINESS_REQUIREMENTS_DOCUMENT.docx
+++ b/BUSINESS_REQUIREMENTS_DOCUMENT.docx
@@ -7,6 +7,29 @@
         <w:pStyle w:val="Heading1"/>
       </w:pPr>
       <w:r>
+        <w:t>Table of Contents</w:t>
+      </w:r>
+    </w:p>
+    <w:p>
+      <w:r>
+        <w:fldChar w:fldCharType="begin"/>
+        <w:instrText xml:space="preserve">TOC \o "1-3" \h \z \u</w:instrText>
+        <w:fldChar w:fldCharType="separate">
+          <w:t>Right-click and Update Field to generate table of contents.</w:t>
+        </w:fldChar>
+        <w:fldChar w:fldCharType="end"/>
+      </w:r>
+    </w:p>
+    <w:p>
+      <w:r>
+        <w:br w:type="page"/>
+      </w:r>
+    </w:p>
+    <w:p>
+      <w:pPr>
+        <w:pStyle w:val="Heading1"/>
+      </w:pPr>
+      <w:r>
         <w:t>Business Requirements Document (BRD)</w:t>
       </w:r>
     </w:p>
@@ -2112,14 +2135,6 @@
         <w:pStyle w:val="ListBullet"/>
       </w:pPr>
       <w:r>
-        <w:t>`KasookooSDK.call.video(videoEnabled)` - toggle local video</w:t>
-      </w:r>
-    </w:p>
-    <w:p>
-      <w:pPr>
-        <w:pStyle w:val="ListBullet"/>
-      </w:pPr>
-      <w:r>
         <w:t>`KasookooSDK.call.getActiveCall()` - fetch current active call object</w:t>
       </w:r>
     </w:p>
@@ -3273,14 +3288,6 @@
       </w:r>
     </w:p>
     <w:p/>
-    <w:p>
-      <w:pPr>
-        <w:pStyle w:val="ListBullet"/>
-      </w:pPr>
-      <w:r>
-        <w:t>Frontend team can integrate core SDK in less than 2 development days.</w:t>
-      </w:r>
-    </w:p>
     <w:p>
       <w:pPr>
         <w:pStyle w:val="ListBullet"/>

</xml_diff>